<commit_message>
docs: repositório e board na organização ScaTecnologia-Lab2
Links do repositório e do board atualizados; STATUS registra a
transferência e o que precisou ser religado (CodeQL, secret scanning).

Co-Authored-By: Claude Opus 5.5 <noreply@anthropic.com>
</commit_message>
<xml_diff>
--- a/docs/BACKLOG_KANBAN.docx
+++ b/docs/BACKLOG_KANBAN.docx
@@ -893,7 +893,7 @@
           <w:rPr>
             <w:rStyle w:val="Hyperlink"/>
           </w:rPr>
-          <w:t xml:space="preserve">https://github.com/users/ScaTecnologia/projects/2</w:t>
+          <w:t xml:space="preserve">https://github.com/orgs/ScaTecnologia-Lab2/projects/1</w:t>
         </w:r>
       </w:hyperlink>
       <w:r>
@@ -938,13 +938,13 @@
           <w:b/>
           <w:bCs/>
         </w:rPr>
-        <w:t xml:space="preserve">Automações nativas ligadas</w:t>
-      </w:r>
-      <w:r>
-        <w:t xml:space="preserve"> </w:t>
-      </w:r>
-      <w:r>
-        <w:t xml:space="preserve">(projeto → ⋯ → Workflows):</w:t>
+        <w:t xml:space="preserve">Automações nativas</w:t>
+      </w:r>
+      <w:r>
+        <w:t xml:space="preserve"> </w:t>
+      </w:r>
+      <w:r>
+        <w:t xml:space="preserve">(projeto → ⋯ → Workflows) — precisam ser ligadas na tela; a API não permite:</w:t>
       </w:r>
       <w:r>
         <w:t xml:space="preserve"> </w:t>
@@ -1099,7 +1099,7 @@
           <w:rPr>
             <w:rStyle w:val="Hyperlink"/>
           </w:rPr>
-          <w:t xml:space="preserve">https://github.com/ScaTecnologia/laboratorio-claude-code/issues/new/choose</w:t>
+          <w:t xml:space="preserve">https://github.com/ScaTecnologia-Lab2/laboratorio-claude-code/issues/new/choose</w:t>
         </w:r>
       </w:hyperlink>
       <w:r>

</xml_diff>